<commit_message>
working on logic exercise 5
</commit_message>
<xml_diff>
--- a/Fall-2025/comparative-languages/CS 3180-F25-Midterm.docx
+++ b/Fall-2025/comparative-languages/CS 3180-F25-Midterm.docx
@@ -673,7 +673,7 @@
           </mc:Choice>
           <mc:Fallback>
             <w:pict>
-              <v:line w14:anchorId="39011B4F" id="Straight Connector 1" o:spid="_x0000_s1026" style="position:absolute;z-index:251660800;visibility:visible;mso-wrap-style:square;mso-wrap-distance-left:9pt;mso-wrap-distance-top:0;mso-wrap-distance-right:9pt;mso-wrap-distance-bottom:0;mso-position-horizontal:absolute;mso-position-horizontal-relative:text;mso-position-vertical:absolute;mso-position-vertical-relative:text" from="114.6pt,2.2pt" to="114.6pt,79pt" o:gfxdata="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" strokecolor="black [3213]" strokeweight="1.5pt">
+              <v:line w14:anchorId="17568A32" id="Straight Connector 1" o:spid="_x0000_s1026" style="position:absolute;z-index:251660800;visibility:visible;mso-wrap-style:square;mso-wrap-distance-left:9pt;mso-wrap-distance-top:0;mso-wrap-distance-right:9pt;mso-wrap-distance-bottom:0;mso-position-horizontal:absolute;mso-position-horizontal-relative:text;mso-position-vertical:absolute;mso-position-vertical-relative:text" from="114.6pt,2.2pt" to="114.6pt,79pt" o:gfxdata="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" strokecolor="black [3213]" strokeweight="1.5pt">
                 <v:stroke joinstyle="miter"/>
               </v:line>
             </w:pict>
@@ -1538,7 +1538,6 @@
           <w:rFonts w:ascii="Palatino Linotype" w:eastAsia="Palatino Linotype" w:hAnsi="Palatino Linotype" w:cs="Palatino Linotype"/>
           <w:sz w:val="24"/>
           <w:szCs w:val="24"/>
-          <w:highlight w:val="yellow"/>
         </w:rPr>
         <w:t>b)</w:t>
       </w:r>
@@ -2258,7 +2257,7 @@
           </mc:Choice>
           <mc:Fallback>
             <w:pict>
-              <v:shapetype w14:anchorId="550CDD3A" id="_x0000_t32" coordsize="21600,21600" o:spt="32" o:oned="t" path="m,l21600,21600e" filled="f">
+              <v:shapetype w14:anchorId="316F7638" id="_x0000_t32" coordsize="21600,21600" o:spt="32" o:oned="t" path="m,l21600,21600e" filled="f">
                 <v:path arrowok="t" fillok="f" o:connecttype="none"/>
                 <o:lock v:ext="edit" shapetype="t"/>
               </v:shapetype>
@@ -2331,7 +2330,7 @@
           </mc:Choice>
           <mc:Fallback>
             <w:pict>
-              <v:shape w14:anchorId="2E10DBCD" id="Straight Arrow Connector 5" o:spid="_x0000_s1026" type="#_x0000_t32" style="position:absolute;margin-left:171pt;margin-top:23.4pt;width:53.4pt;height:0;z-index:251022336;visibility:visible;mso-wrap-style:square;mso-wrap-distance-left:9pt;mso-wrap-distance-top:0;mso-wrap-distance-right:9pt;mso-wrap-distance-bottom:0;mso-position-horizontal:absolute;mso-position-horizontal-relative:text;mso-position-vertical:absolute;mso-position-vertical-relative:text" o:gfxdata="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" strokecolor="black [3200]" strokeweight="1.5pt">
+              <v:shape w14:anchorId="6E3F2F5B" id="Straight Arrow Connector 5" o:spid="_x0000_s1026" type="#_x0000_t32" style="position:absolute;margin-left:171pt;margin-top:23.4pt;width:53.4pt;height:0;z-index:251022336;visibility:visible;mso-wrap-style:square;mso-wrap-distance-left:9pt;mso-wrap-distance-top:0;mso-wrap-distance-right:9pt;mso-wrap-distance-bottom:0;mso-position-horizontal:absolute;mso-position-horizontal-relative:text;mso-position-vertical:absolute;mso-position-vertical-relative:text" o:gfxdata="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" strokecolor="black [3200]" strokeweight="1.5pt">
                 <v:stroke endarrow="block" joinstyle="miter"/>
               </v:shape>
             </w:pict>
@@ -2400,7 +2399,7 @@
           </mc:Choice>
           <mc:Fallback>
             <w:pict>
-              <v:shape w14:anchorId="444CB21C" id="Straight Arrow Connector 5" o:spid="_x0000_s1026" type="#_x0000_t32" style="position:absolute;margin-left:283.2pt;margin-top:23.4pt;width:53.4pt;height:0;z-index:251145216;visibility:visible;mso-wrap-style:square;mso-wrap-distance-left:9pt;mso-wrap-distance-top:0;mso-wrap-distance-right:9pt;mso-wrap-distance-bottom:0;mso-position-horizontal:absolute;mso-position-horizontal-relative:text;mso-position-vertical:absolute;mso-position-vertical-relative:text" o:gfxdata="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" strokecolor="black [3200]" strokeweight="1.5pt">
+              <v:shape w14:anchorId="6B37A259" id="Straight Arrow Connector 5" o:spid="_x0000_s1026" type="#_x0000_t32" style="position:absolute;margin-left:283.2pt;margin-top:23.4pt;width:53.4pt;height:0;z-index:251145216;visibility:visible;mso-wrap-style:square;mso-wrap-distance-left:9pt;mso-wrap-distance-top:0;mso-wrap-distance-right:9pt;mso-wrap-distance-bottom:0;mso-position-horizontal:absolute;mso-position-horizontal-relative:text;mso-position-vertical:absolute;mso-position-vertical-relative:text" o:gfxdata="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" strokecolor="black [3200]" strokeweight="1.5pt">
                 <v:stroke endarrow="block" joinstyle="miter"/>
               </v:shape>
             </w:pict>
@@ -2479,7 +2478,7 @@
           </mc:Choice>
           <mc:Fallback>
             <w:pict>
-              <v:rect w14:anchorId="288BD600" id="Rectangle 3" o:spid="_x0000_s1026" style="position:absolute;margin-left:-1.2pt;margin-top:2.55pt;width:78.6pt;height:44.4pt;z-index:250806272;visibility:visible;mso-wrap-style:square;mso-wrap-distance-left:9pt;mso-wrap-distance-top:0;mso-wrap-distance-right:9pt;mso-wrap-distance-bottom:0;mso-position-horizontal:absolute;mso-position-horizontal-relative:text;mso-position-vertical:absolute;mso-position-vertical-relative:text;v-text-anchor:middle" o:gfxdata="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" filled="f" strokecolor="black [3213]" strokeweight="1.5pt"/>
+              <v:rect w14:anchorId="0DDD6F99" id="Rectangle 3" o:spid="_x0000_s1026" style="position:absolute;margin-left:-1.2pt;margin-top:2.55pt;width:78.6pt;height:44.4pt;z-index:250806272;visibility:visible;mso-wrap-style:square;mso-wrap-distance-left:9pt;mso-wrap-distance-top:0;mso-wrap-distance-right:9pt;mso-wrap-distance-bottom:0;mso-position-horizontal:absolute;mso-position-horizontal-relative:text;mso-position-vertical:absolute;mso-position-vertical-relative:text;v-text-anchor:middle" o:gfxdata="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" filled="f" strokecolor="black [3213]" strokeweight="1.5pt"/>
             </w:pict>
           </mc:Fallback>
         </mc:AlternateContent>
@@ -2548,7 +2547,7 @@
           </mc:Choice>
           <mc:Fallback>
             <w:pict>
-              <v:line w14:anchorId="3C7E8828" id="Straight Connector 4" o:spid="_x0000_s1026" style="position:absolute;z-index:250830848;visibility:visible;mso-wrap-style:square;mso-wrap-distance-left:9pt;mso-wrap-distance-top:0;mso-wrap-distance-right:9pt;mso-wrap-distance-bottom:0;mso-position-horizontal:absolute;mso-position-horizontal-relative:text;mso-position-vertical:absolute;mso-position-vertical-relative:text" from="37.8pt,2.55pt" to="37.8pt,46.95pt" o:gfxdata="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" strokecolor="black [3213]" strokeweight="1.5pt">
+              <v:line w14:anchorId="34C0436D" id="Straight Connector 4" o:spid="_x0000_s1026" style="position:absolute;z-index:250830848;visibility:visible;mso-wrap-style:square;mso-wrap-distance-left:9pt;mso-wrap-distance-top:0;mso-wrap-distance-right:9pt;mso-wrap-distance-bottom:0;mso-position-horizontal:absolute;mso-position-horizontal-relative:text;mso-position-vertical:absolute;mso-position-vertical-relative:text" from="37.8pt,2.55pt" to="37.8pt,46.95pt" o:gfxdata="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" strokecolor="black [3213]" strokeweight="1.5pt">
                 <v:stroke joinstyle="miter"/>
               </v:line>
             </w:pict>
@@ -2619,7 +2618,7 @@
           </mc:Choice>
           <mc:Fallback>
             <w:pict>
-              <v:line w14:anchorId="7BE89FFB" id="Straight Connector 4" o:spid="_x0000_s1026" style="position:absolute;z-index:250966016;visibility:visible;mso-wrap-style:square;mso-wrap-distance-left:9pt;mso-wrap-distance-top:0;mso-wrap-distance-right:9pt;mso-wrap-distance-bottom:0;mso-position-horizontal:absolute;mso-position-horizontal-relative:text;mso-position-vertical:absolute;mso-position-vertical-relative:text" from="150.6pt,2.4pt" to="150.6pt,46.8pt" o:gfxdata="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" strokecolor="black [3213]" strokeweight="1.5pt">
+              <v:line w14:anchorId="57C48AC5" id="Straight Connector 4" o:spid="_x0000_s1026" style="position:absolute;z-index:250966016;visibility:visible;mso-wrap-style:square;mso-wrap-distance-left:9pt;mso-wrap-distance-top:0;mso-wrap-distance-right:9pt;mso-wrap-distance-bottom:0;mso-position-horizontal:absolute;mso-position-horizontal-relative:text;mso-position-vertical:absolute;mso-position-vertical-relative:text" from="150.6pt,2.4pt" to="150.6pt,46.8pt" o:gfxdata="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" strokecolor="black [3213]" strokeweight="1.5pt">
                 <v:stroke joinstyle="miter"/>
               </v:line>
             </w:pict>
@@ -2698,7 +2697,7 @@
           </mc:Choice>
           <mc:Fallback>
             <w:pict>
-              <v:rect w14:anchorId="4791651A" id="Rectangle 3" o:spid="_x0000_s1026" style="position:absolute;margin-left:111.6pt;margin-top:2.4pt;width:78.6pt;height:44.4pt;z-index:250907648;visibility:visible;mso-wrap-style:square;mso-wrap-distance-left:9pt;mso-wrap-distance-top:0;mso-wrap-distance-right:9pt;mso-wrap-distance-bottom:0;mso-position-horizontal:absolute;mso-position-horizontal-relative:text;mso-position-vertical:absolute;mso-position-vertical-relative:text;v-text-anchor:middle" o:gfxdata="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" filled="f" strokecolor="black [3213]" strokeweight="1.5pt"/>
+              <v:rect w14:anchorId="25D15BE4" id="Rectangle 3" o:spid="_x0000_s1026" style="position:absolute;margin-left:111.6pt;margin-top:2.4pt;width:78.6pt;height:44.4pt;z-index:250907648;visibility:visible;mso-wrap-style:square;mso-wrap-distance-left:9pt;mso-wrap-distance-top:0;mso-wrap-distance-right:9pt;mso-wrap-distance-bottom:0;mso-position-horizontal:absolute;mso-position-horizontal-relative:text;mso-position-vertical:absolute;mso-position-vertical-relative:text;v-text-anchor:middle" o:gfxdata="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" filled="f" strokecolor="black [3213]" strokeweight="1.5pt"/>
             </w:pict>
           </mc:Fallback>
         </mc:AlternateContent>
@@ -2767,7 +2766,7 @@
           </mc:Choice>
           <mc:Fallback>
             <w:pict>
-              <v:line w14:anchorId="66ADB509" id="Straight Connector 4" o:spid="_x0000_s1026" style="position:absolute;z-index:251104256;visibility:visible;mso-wrap-style:square;mso-wrap-distance-left:9pt;mso-wrap-distance-top:0;mso-wrap-distance-right:9pt;mso-wrap-distance-bottom:0;mso-position-horizontal:absolute;mso-position-horizontal-relative:text;mso-position-vertical:absolute;mso-position-vertical-relative:text" from="262.8pt,2.4pt" to="262.8pt,46.8pt" o:gfxdata="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" strokecolor="black [3213]" strokeweight="1.5pt">
+              <v:line w14:anchorId="502ABED0" id="Straight Connector 4" o:spid="_x0000_s1026" style="position:absolute;z-index:251104256;visibility:visible;mso-wrap-style:square;mso-wrap-distance-left:9pt;mso-wrap-distance-top:0;mso-wrap-distance-right:9pt;mso-wrap-distance-bottom:0;mso-position-horizontal:absolute;mso-position-horizontal-relative:text;mso-position-vertical:absolute;mso-position-vertical-relative:text" from="262.8pt,2.4pt" to="262.8pt,46.8pt" o:gfxdata="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" strokecolor="black [3213]" strokeweight="1.5pt">
                 <v:stroke joinstyle="miter"/>
               </v:line>
             </w:pict>
@@ -2846,7 +2845,7 @@
           </mc:Choice>
           <mc:Fallback>
             <w:pict>
-              <v:rect w14:anchorId="69604A43" id="Rectangle 3" o:spid="_x0000_s1026" style="position:absolute;margin-left:223.8pt;margin-top:2.4pt;width:78.6pt;height:44.4pt;z-index:251063296;visibility:visible;mso-wrap-style:square;mso-wrap-distance-left:9pt;mso-wrap-distance-top:0;mso-wrap-distance-right:9pt;mso-wrap-distance-bottom:0;mso-position-horizontal:absolute;mso-position-horizontal-relative:text;mso-position-vertical:absolute;mso-position-vertical-relative:text;v-text-anchor:middle" o:gfxdata="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" filled="f" strokecolor="black [3213]" strokeweight="1.5pt"/>
+              <v:rect w14:anchorId="3ACCAE26" id="Rectangle 3" o:spid="_x0000_s1026" style="position:absolute;margin-left:223.8pt;margin-top:2.4pt;width:78.6pt;height:44.4pt;z-index:251063296;visibility:visible;mso-wrap-style:square;mso-wrap-distance-left:9pt;mso-wrap-distance-top:0;mso-wrap-distance-right:9pt;mso-wrap-distance-bottom:0;mso-position-horizontal:absolute;mso-position-horizontal-relative:text;mso-position-vertical:absolute;mso-position-vertical-relative:text;v-text-anchor:middle" o:gfxdata="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" filled="f" strokecolor="black [3213]" strokeweight="1.5pt"/>
             </w:pict>
           </mc:Fallback>
         </mc:AlternateContent>
@@ -2915,7 +2914,7 @@
           </mc:Choice>
           <mc:Fallback>
             <w:pict>
-              <v:line w14:anchorId="1B2580EF" id="Straight Connector 4" o:spid="_x0000_s1026" style="position:absolute;z-index:251245568;visibility:visible;mso-wrap-style:square;mso-wrap-distance-left:9pt;mso-wrap-distance-top:0;mso-wrap-distance-right:9pt;mso-wrap-distance-bottom:0;mso-position-horizontal:absolute;mso-position-horizontal-relative:text;mso-position-vertical:absolute;mso-position-vertical-relative:text" from="379.8pt,2.6pt" to="379.8pt,47pt" o:gfxdata="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" strokecolor="black [3213]" strokeweight="1.5pt">
+              <v:line w14:anchorId="22D048F4" id="Straight Connector 4" o:spid="_x0000_s1026" style="position:absolute;z-index:251245568;visibility:visible;mso-wrap-style:square;mso-wrap-distance-left:9pt;mso-wrap-distance-top:0;mso-wrap-distance-right:9pt;mso-wrap-distance-bottom:0;mso-position-horizontal:absolute;mso-position-horizontal-relative:text;mso-position-vertical:absolute;mso-position-vertical-relative:text" from="379.8pt,2.6pt" to="379.8pt,47pt" o:gfxdata="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" strokecolor="black [3213]" strokeweight="1.5pt">
                 <v:stroke joinstyle="miter"/>
               </v:line>
             </w:pict>
@@ -2994,7 +2993,7 @@
           </mc:Choice>
           <mc:Fallback>
             <w:pict>
-              <v:rect w14:anchorId="166F1F97" id="Rectangle 3" o:spid="_x0000_s1026" style="position:absolute;margin-left:340.8pt;margin-top:2.6pt;width:78.6pt;height:44.4pt;z-index:251195392;visibility:visible;mso-wrap-style:square;mso-wrap-distance-left:9pt;mso-wrap-distance-top:0;mso-wrap-distance-right:9pt;mso-wrap-distance-bottom:0;mso-position-horizontal:absolute;mso-position-horizontal-relative:text;mso-position-vertical:absolute;mso-position-vertical-relative:text;v-text-anchor:middle" o:gfxdata="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" filled="f" strokecolor="black [3213]" strokeweight="1.5pt"/>
+              <v:rect w14:anchorId="1AC7ED47" id="Rectangle 3" o:spid="_x0000_s1026" style="position:absolute;margin-left:340.8pt;margin-top:2.6pt;width:78.6pt;height:44.4pt;z-index:251195392;visibility:visible;mso-wrap-style:square;mso-wrap-distance-left:9pt;mso-wrap-distance-top:0;mso-wrap-distance-right:9pt;mso-wrap-distance-bottom:0;mso-position-horizontal:absolute;mso-position-horizontal-relative:text;mso-position-vertical:absolute;mso-position-vertical-relative:text;v-text-anchor:middle" o:gfxdata="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" filled="f" strokecolor="black [3213]" strokeweight="1.5pt"/>
             </w:pict>
           </mc:Fallback>
         </mc:AlternateContent>
@@ -3081,7 +3080,7 @@
           </mc:Choice>
           <mc:Fallback>
             <w:pict>
-              <v:shape w14:anchorId="317B6DEF" id="Straight Arrow Connector 5" o:spid="_x0000_s1026" type="#_x0000_t32" style="position:absolute;margin-left:394.2pt;margin-top:4.2pt;width:53.4pt;height:0;z-index:251283456;visibility:visible;mso-wrap-style:square;mso-wrap-distance-left:9pt;mso-wrap-distance-top:0;mso-wrap-distance-right:9pt;mso-wrap-distance-bottom:0;mso-position-horizontal:absolute;mso-position-horizontal-relative:text;mso-position-vertical:absolute;mso-position-vertical-relative:text" o:gfxdata="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" strokecolor="black [3200]" strokeweight="1.5pt">
+              <v:shape w14:anchorId="0026308E" id="Straight Arrow Connector 5" o:spid="_x0000_s1026" type="#_x0000_t32" style="position:absolute;margin-left:394.2pt;margin-top:4.2pt;width:53.4pt;height:0;z-index:251283456;visibility:visible;mso-wrap-style:square;mso-wrap-distance-left:9pt;mso-wrap-distance-top:0;mso-wrap-distance-right:9pt;mso-wrap-distance-bottom:0;mso-position-horizontal:absolute;mso-position-horizontal-relative:text;mso-position-vertical:absolute;mso-position-vertical-relative:text" o:gfxdata="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" strokecolor="black [3200]" strokeweight="1.5pt">
                 <v:stroke endarrow="block" joinstyle="miter"/>
               </v:shape>
             </w:pict>
@@ -3390,7 +3389,7 @@
           </mc:Choice>
           <mc:Fallback>
             <w:pict>
-              <v:rect w14:anchorId="161BE0AD" id="Rectangle 3" o:spid="_x0000_s1026" style="position:absolute;margin-left:112.8pt;margin-top:3.6pt;width:78.6pt;height:44.4pt;z-index:251340800;visibility:visible;mso-wrap-style:square;mso-wrap-distance-left:9pt;mso-wrap-distance-top:0;mso-wrap-distance-right:9pt;mso-wrap-distance-bottom:0;mso-position-horizontal:absolute;mso-position-horizontal-relative:text;mso-position-vertical:absolute;mso-position-vertical-relative:text;v-text-anchor:middle" o:gfxdata="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" filled="f" strokecolor="black [3213]" strokeweight="1.5pt"/>
+              <v:rect w14:anchorId="711386E6" id="Rectangle 3" o:spid="_x0000_s1026" style="position:absolute;margin-left:112.8pt;margin-top:3.6pt;width:78.6pt;height:44.4pt;z-index:251340800;visibility:visible;mso-wrap-style:square;mso-wrap-distance-left:9pt;mso-wrap-distance-top:0;mso-wrap-distance-right:9pt;mso-wrap-distance-bottom:0;mso-position-horizontal:absolute;mso-position-horizontal-relative:text;mso-position-vertical:absolute;mso-position-vertical-relative:text;v-text-anchor:middle" o:gfxdata="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" filled="f" strokecolor="black [3213]" strokeweight="1.5pt"/>
             </w:pict>
           </mc:Fallback>
         </mc:AlternateContent>
@@ -3459,7 +3458,7 @@
           </mc:Choice>
           <mc:Fallback>
             <w:pict>
-              <v:line w14:anchorId="3680500C" id="Straight Connector 4" o:spid="_x0000_s1026" style="position:absolute;z-index:251355136;visibility:visible;mso-wrap-style:square;mso-wrap-distance-left:9pt;mso-wrap-distance-top:0;mso-wrap-distance-right:9pt;mso-wrap-distance-bottom:0;mso-position-horizontal:absolute;mso-position-horizontal-relative:text;mso-position-vertical:absolute;mso-position-vertical-relative:text" from="151.8pt,3.6pt" to="151.8pt,48pt" o:gfxdata="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" strokecolor="black [3213]" strokeweight="1.5pt">
+              <v:line w14:anchorId="1CA92AD5" id="Straight Connector 4" o:spid="_x0000_s1026" style="position:absolute;z-index:251355136;visibility:visible;mso-wrap-style:square;mso-wrap-distance-left:9pt;mso-wrap-distance-top:0;mso-wrap-distance-right:9pt;mso-wrap-distance-bottom:0;mso-position-horizontal:absolute;mso-position-horizontal-relative:text;mso-position-vertical:absolute;mso-position-vertical-relative:text" from="151.8pt,3.6pt" to="151.8pt,48pt" o:gfxdata="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" strokecolor="black [3213]" strokeweight="1.5pt">
                 <v:stroke joinstyle="miter"/>
               </v:line>
             </w:pict>
@@ -3530,7 +3529,7 @@
           </mc:Choice>
           <mc:Fallback>
             <w:pict>
-              <v:line w14:anchorId="618F13EC" id="Straight Connector 4" o:spid="_x0000_s1026" style="position:absolute;z-index:251312128;visibility:visible;mso-wrap-style:square;mso-wrap-distance-left:9pt;mso-wrap-distance-top:0;mso-wrap-distance-right:9pt;mso-wrap-distance-bottom:0;mso-position-horizontal:absolute;mso-position-horizontal-relative:text;mso-position-vertical:absolute;mso-position-vertical-relative:text" from="39pt,3.6pt" to="39pt,48pt" o:gfxdata="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" strokecolor="black [3213]" strokeweight="1.5pt">
+              <v:line w14:anchorId="338D779A" id="Straight Connector 4" o:spid="_x0000_s1026" style="position:absolute;z-index:251312128;visibility:visible;mso-wrap-style:square;mso-wrap-distance-left:9pt;mso-wrap-distance-top:0;mso-wrap-distance-right:9pt;mso-wrap-distance-bottom:0;mso-position-horizontal:absolute;mso-position-horizontal-relative:text;mso-position-vertical:absolute;mso-position-vertical-relative:text" from="39pt,3.6pt" to="39pt,48pt" o:gfxdata="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" strokecolor="black [3213]" strokeweight="1.5pt">
                 <v:stroke joinstyle="miter"/>
               </v:line>
             </w:pict>
@@ -3609,7 +3608,7 @@
           </mc:Choice>
           <mc:Fallback>
             <w:pict>
-              <v:rect w14:anchorId="3B2A16CA" id="Rectangle 3" o:spid="_x0000_s1026" style="position:absolute;margin-left:0;margin-top:3.6pt;width:78.6pt;height:44.4pt;z-index:251297792;visibility:visible;mso-wrap-style:square;mso-wrap-distance-left:9pt;mso-wrap-distance-top:0;mso-wrap-distance-right:9pt;mso-wrap-distance-bottom:0;mso-position-horizontal:absolute;mso-position-horizontal-relative:text;mso-position-vertical:absolute;mso-position-vertical-relative:text;v-text-anchor:middle" o:gfxdata="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" filled="f" strokecolor="black [3213]" strokeweight="1.5pt"/>
+              <v:rect w14:anchorId="3BD7B543" id="Rectangle 3" o:spid="_x0000_s1026" style="position:absolute;margin-left:0;margin-top:3.6pt;width:78.6pt;height:44.4pt;z-index:251297792;visibility:visible;mso-wrap-style:square;mso-wrap-distance-left:9pt;mso-wrap-distance-top:0;mso-wrap-distance-right:9pt;mso-wrap-distance-bottom:0;mso-position-horizontal:absolute;mso-position-horizontal-relative:text;mso-position-vertical:absolute;mso-position-vertical-relative:text;v-text-anchor:middle" o:gfxdata="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" filled="f" strokecolor="black [3213]" strokeweight="1.5pt"/>
             </w:pict>
           </mc:Fallback>
         </mc:AlternateContent>
@@ -3696,7 +3695,7 @@
           </mc:Choice>
           <mc:Fallback>
             <w:pict>
-              <v:shape w14:anchorId="1449B9B1" id="Straight Arrow Connector 5" o:spid="_x0000_s1026" type="#_x0000_t32" style="position:absolute;margin-left:59.4pt;margin-top:5.8pt;width:53.4pt;height:0;z-index:251326464;visibility:visible;mso-wrap-style:square;mso-wrap-distance-left:9pt;mso-wrap-distance-top:0;mso-wrap-distance-right:9pt;mso-wrap-distance-bottom:0;mso-position-horizontal:absolute;mso-position-horizontal-relative:text;mso-position-vertical:absolute;mso-position-vertical-relative:text" o:gfxdata="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" strokecolor="black [3200]" strokeweight="1.5pt">
+              <v:shape w14:anchorId="22671956" id="Straight Arrow Connector 5" o:spid="_x0000_s1026" type="#_x0000_t32" style="position:absolute;margin-left:59.4pt;margin-top:5.8pt;width:53.4pt;height:0;z-index:251326464;visibility:visible;mso-wrap-style:square;mso-wrap-distance-left:9pt;mso-wrap-distance-top:0;mso-wrap-distance-right:9pt;mso-wrap-distance-bottom:0;mso-position-horizontal:absolute;mso-position-horizontal-relative:text;mso-position-vertical:absolute;mso-position-vertical-relative:text" o:gfxdata="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" strokecolor="black [3200]" strokeweight="1.5pt">
                 <v:stroke endarrow="block" joinstyle="miter"/>
               </v:shape>
             </w:pict>
@@ -3877,7 +3876,7 @@
           </mc:Choice>
           <mc:Fallback>
             <w:pict>
-              <v:line w14:anchorId="521A32F8" id="Straight Connector 4" o:spid="_x0000_s1026" style="position:absolute;z-index:251741184;visibility:visible;mso-wrap-style:square;mso-height-percent:0;mso-wrap-distance-left:9pt;mso-wrap-distance-top:0;mso-wrap-distance-right:9pt;mso-wrap-distance-bottom:0;mso-position-horizontal:absolute;mso-position-horizontal-relative:text;mso-position-vertical:absolute;mso-position-vertical-relative:text;mso-height-percent:0;mso-height-relative:margin" from="339.6pt,1.2pt" to="339.6pt,30pt" o:gfxdata="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" strokecolor="black [3213]" strokeweight="1.5pt">
+              <v:line w14:anchorId="62D620D9" id="Straight Connector 4" o:spid="_x0000_s1026" style="position:absolute;z-index:251741184;visibility:visible;mso-wrap-style:square;mso-height-percent:0;mso-wrap-distance-left:9pt;mso-wrap-distance-top:0;mso-wrap-distance-right:9pt;mso-wrap-distance-bottom:0;mso-position-horizontal:absolute;mso-position-horizontal-relative:text;mso-position-vertical:absolute;mso-position-vertical-relative:text;mso-height-percent:0;mso-height-relative:margin" from="339.6pt,1.2pt" to="339.6pt,30pt" o:gfxdata="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" strokecolor="black [3213]" strokeweight="1.5pt">
                 <v:stroke joinstyle="miter"/>
               </v:line>
             </w:pict>
@@ -3962,7 +3961,7 @@
           </mc:Choice>
           <mc:Fallback>
             <w:pict>
-              <v:rect w14:anchorId="7F55A40A" id="Rectangle 3" o:spid="_x0000_s1026" style="position:absolute;margin-left:309pt;margin-top:1.2pt;width:59.4pt;height:28.8pt;z-index:251715584;visibility:visible;mso-wrap-style:square;mso-width-percent:0;mso-height-percent:0;mso-wrap-distance-left:9pt;mso-wrap-distance-top:0;mso-wrap-distance-right:9pt;mso-wrap-distance-bottom:0;mso-position-horizontal:absolute;mso-position-horizontal-relative:text;mso-position-vertical:absolute;mso-position-vertical-relative:text;mso-width-percent:0;mso-height-percent:0;mso-width-relative:margin;mso-height-relative:margin;v-text-anchor:middle" o:gfxdata="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" filled="f" strokecolor="black [3213]" strokeweight="1.5pt"/>
+              <v:rect w14:anchorId="5FC418FC" id="Rectangle 3" o:spid="_x0000_s1026" style="position:absolute;margin-left:309pt;margin-top:1.2pt;width:59.4pt;height:28.8pt;z-index:251715584;visibility:visible;mso-wrap-style:square;mso-width-percent:0;mso-height-percent:0;mso-wrap-distance-left:9pt;mso-wrap-distance-top:0;mso-wrap-distance-right:9pt;mso-wrap-distance-bottom:0;mso-position-horizontal:absolute;mso-position-horizontal-relative:text;mso-position-vertical:absolute;mso-position-vertical-relative:text;mso-width-percent:0;mso-height-percent:0;mso-width-relative:margin;mso-height-relative:margin;v-text-anchor:middle" o:gfxdata="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" filled="f" strokecolor="black [3213]" strokeweight="1.5pt"/>
             </w:pict>
           </mc:Fallback>
         </mc:AlternateContent>
@@ -4034,7 +4033,7 @@
           </mc:Choice>
           <mc:Fallback>
             <w:pict>
-              <v:line w14:anchorId="5FD90E1A" id="Straight Connector 4" o:spid="_x0000_s1026" style="position:absolute;z-index:251684864;visibility:visible;mso-wrap-style:square;mso-height-percent:0;mso-wrap-distance-left:9pt;mso-wrap-distance-top:0;mso-wrap-distance-right:9pt;mso-wrap-distance-bottom:0;mso-position-horizontal:absolute;mso-position-horizontal-relative:text;mso-position-vertical:absolute;mso-position-vertical-relative:text;mso-height-percent:0;mso-height-relative:margin" from="234pt,1.2pt" to="234pt,30pt" o:gfxdata="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" strokecolor="black [3213]" strokeweight="1.5pt">
+              <v:line w14:anchorId="379A8E22" id="Straight Connector 4" o:spid="_x0000_s1026" style="position:absolute;z-index:251684864;visibility:visible;mso-wrap-style:square;mso-height-percent:0;mso-wrap-distance-left:9pt;mso-wrap-distance-top:0;mso-wrap-distance-right:9pt;mso-wrap-distance-bottom:0;mso-position-horizontal:absolute;mso-position-horizontal-relative:text;mso-position-vertical:absolute;mso-position-vertical-relative:text;mso-height-percent:0;mso-height-relative:margin" from="234pt,1.2pt" to="234pt,30pt" o:gfxdata="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" strokecolor="black [3213]" strokeweight="1.5pt">
                 <v:stroke joinstyle="miter"/>
               </v:line>
             </w:pict>
@@ -4119,7 +4118,7 @@
           </mc:Choice>
           <mc:Fallback>
             <w:pict>
-              <v:rect w14:anchorId="051F367B" id="Rectangle 3" o:spid="_x0000_s1026" style="position:absolute;margin-left:203.4pt;margin-top:1.2pt;width:59.4pt;height:28.8pt;z-index:251658240;visibility:visible;mso-wrap-style:square;mso-width-percent:0;mso-height-percent:0;mso-wrap-distance-left:9pt;mso-wrap-distance-top:0;mso-wrap-distance-right:9pt;mso-wrap-distance-bottom:0;mso-position-horizontal:absolute;mso-position-horizontal-relative:text;mso-position-vertical:absolute;mso-position-vertical-relative:text;mso-width-percent:0;mso-height-percent:0;mso-width-relative:margin;mso-height-relative:margin;v-text-anchor:middle" o:gfxdata="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" filled="f" strokecolor="black [3213]" strokeweight="1.5pt"/>
+              <v:rect w14:anchorId="54201EF2" id="Rectangle 3" o:spid="_x0000_s1026" style="position:absolute;margin-left:203.4pt;margin-top:1.2pt;width:59.4pt;height:28.8pt;z-index:251658240;visibility:visible;mso-wrap-style:square;mso-width-percent:0;mso-height-percent:0;mso-wrap-distance-left:9pt;mso-wrap-distance-top:0;mso-wrap-distance-right:9pt;mso-wrap-distance-bottom:0;mso-position-horizontal:absolute;mso-position-horizontal-relative:text;mso-position-vertical:absolute;mso-position-vertical-relative:text;mso-width-percent:0;mso-height-percent:0;mso-width-relative:margin;mso-height-relative:margin;v-text-anchor:middle" o:gfxdata="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" filled="f" strokecolor="black [3213]" strokeweight="1.5pt"/>
             </w:pict>
           </mc:Fallback>
         </mc:AlternateContent>
@@ -4202,7 +4201,7 @@
           </mc:Choice>
           <mc:Fallback>
             <w:pict>
-              <v:rect w14:anchorId="338D3056" id="Rectangle 3" o:spid="_x0000_s1026" style="position:absolute;margin-left:101.4pt;margin-top:1.2pt;width:59.4pt;height:28.8pt;z-index:251480064;visibility:visible;mso-wrap-style:square;mso-width-percent:0;mso-height-percent:0;mso-wrap-distance-left:9pt;mso-wrap-distance-top:0;mso-wrap-distance-right:9pt;mso-wrap-distance-bottom:0;mso-position-horizontal:absolute;mso-position-horizontal-relative:text;mso-position-vertical:absolute;mso-position-vertical-relative:text;mso-width-percent:0;mso-height-percent:0;mso-width-relative:margin;mso-height-relative:margin;v-text-anchor:middle" o:gfxdata="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" filled="f" strokecolor="black [3213]" strokeweight="1.5pt"/>
+              <v:rect w14:anchorId="5D4833B8" id="Rectangle 3" o:spid="_x0000_s1026" style="position:absolute;margin-left:101.4pt;margin-top:1.2pt;width:59.4pt;height:28.8pt;z-index:251480064;visibility:visible;mso-wrap-style:square;mso-width-percent:0;mso-height-percent:0;mso-wrap-distance-left:9pt;mso-wrap-distance-top:0;mso-wrap-distance-right:9pt;mso-wrap-distance-bottom:0;mso-position-horizontal:absolute;mso-position-horizontal-relative:text;mso-position-vertical:absolute;mso-position-vertical-relative:text;mso-width-percent:0;mso-height-percent:0;mso-width-relative:margin;mso-height-relative:margin;v-text-anchor:middle" o:gfxdata="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" filled="f" strokecolor="black [3213]" strokeweight="1.5pt"/>
             </w:pict>
           </mc:Fallback>
         </mc:AlternateContent>
@@ -4274,7 +4273,7 @@
           </mc:Choice>
           <mc:Fallback>
             <w:pict>
-              <v:line w14:anchorId="1F501F24" id="Straight Connector 4" o:spid="_x0000_s1026" style="position:absolute;z-index:251510784;visibility:visible;mso-wrap-style:square;mso-height-percent:0;mso-wrap-distance-left:9pt;mso-wrap-distance-top:0;mso-wrap-distance-right:9pt;mso-wrap-distance-bottom:0;mso-position-horizontal:absolute;mso-position-horizontal-relative:text;mso-position-vertical:absolute;mso-position-vertical-relative:text;mso-height-percent:0;mso-height-relative:margin" from="132pt,1.2pt" to="132pt,30pt" o:gfxdata="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" strokecolor="black [3213]" strokeweight="1.5pt">
+              <v:line w14:anchorId="5F751E6A" id="Straight Connector 4" o:spid="_x0000_s1026" style="position:absolute;z-index:251510784;visibility:visible;mso-wrap-style:square;mso-height-percent:0;mso-wrap-distance-left:9pt;mso-wrap-distance-top:0;mso-wrap-distance-right:9pt;mso-wrap-distance-bottom:0;mso-position-horizontal:absolute;mso-position-horizontal-relative:text;mso-position-vertical:absolute;mso-position-vertical-relative:text;mso-height-percent:0;mso-height-relative:margin" from="132pt,1.2pt" to="132pt,30pt" o:gfxdata="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" strokecolor="black [3213]" strokeweight="1.5pt">
                 <v:stroke joinstyle="miter"/>
               </v:line>
             </w:pict>
@@ -4348,7 +4347,7 @@
           </mc:Choice>
           <mc:Fallback>
             <w:pict>
-              <v:line w14:anchorId="1DED58A0" id="Straight Connector 4" o:spid="_x0000_s1026" style="position:absolute;z-index:251421696;visibility:visible;mso-wrap-style:square;mso-height-percent:0;mso-wrap-distance-left:9pt;mso-wrap-distance-top:0;mso-wrap-distance-right:9pt;mso-wrap-distance-bottom:0;mso-position-horizontal:absolute;mso-position-horizontal-relative:text;mso-position-vertical:absolute;mso-position-vertical-relative:text;mso-height-percent:0;mso-height-relative:margin" from="30.6pt,1.4pt" to="30.6pt,30.2pt" o:gfxdata="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" strokecolor="black [3213]" strokeweight="1.5pt">
+              <v:line w14:anchorId="79A38CCE" id="Straight Connector 4" o:spid="_x0000_s1026" style="position:absolute;z-index:251421696;visibility:visible;mso-wrap-style:square;mso-height-percent:0;mso-wrap-distance-left:9pt;mso-wrap-distance-top:0;mso-wrap-distance-right:9pt;mso-wrap-distance-bottom:0;mso-position-horizontal:absolute;mso-position-horizontal-relative:text;mso-position-vertical:absolute;mso-position-vertical-relative:text;mso-height-percent:0;mso-height-relative:margin" from="30.6pt,1.4pt" to="30.6pt,30.2pt" o:gfxdata="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" strokecolor="black [3213]" strokeweight="1.5pt">
                 <v:stroke joinstyle="miter"/>
               </v:line>
             </w:pict>
@@ -4433,7 +4432,7 @@
           </mc:Choice>
           <mc:Fallback>
             <w:pict>
-              <v:rect w14:anchorId="68BB6C41" id="Rectangle 3" o:spid="_x0000_s1026" style="position:absolute;margin-left:0;margin-top:1.4pt;width:59.4pt;height:28.8pt;z-index:251396096;visibility:visible;mso-wrap-style:square;mso-width-percent:0;mso-height-percent:0;mso-wrap-distance-left:9pt;mso-wrap-distance-top:0;mso-wrap-distance-right:9pt;mso-wrap-distance-bottom:0;mso-position-horizontal:absolute;mso-position-horizontal-relative:text;mso-position-vertical:absolute;mso-position-vertical-relative:text;mso-width-percent:0;mso-height-percent:0;mso-width-relative:margin;mso-height-relative:margin;v-text-anchor:middle" o:gfxdata="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" filled="f" strokecolor="black [3213]" strokeweight="1.5pt"/>
+              <v:rect w14:anchorId="4428C903" id="Rectangle 3" o:spid="_x0000_s1026" style="position:absolute;margin-left:0;margin-top:1.4pt;width:59.4pt;height:28.8pt;z-index:251396096;visibility:visible;mso-wrap-style:square;mso-width-percent:0;mso-height-percent:0;mso-wrap-distance-left:9pt;mso-wrap-distance-top:0;mso-wrap-distance-right:9pt;mso-wrap-distance-bottom:0;mso-position-horizontal:absolute;mso-position-horizontal-relative:text;mso-position-vertical:absolute;mso-position-vertical-relative:text;mso-width-percent:0;mso-height-percent:0;mso-width-relative:margin;mso-height-relative:margin;v-text-anchor:middle" o:gfxdata="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" filled="f" strokecolor="black [3213]" strokeweight="1.5pt"/>
             </w:pict>
           </mc:Fallback>
         </mc:AlternateContent>
@@ -4516,7 +4515,7 @@
           </mc:Choice>
           <mc:Fallback>
             <w:pict>
-              <v:shape w14:anchorId="776D4D1A" id="Straight Arrow Connector 5" o:spid="_x0000_s1026" type="#_x0000_t32" style="position:absolute;margin-left:5in;margin-top:6.4pt;width:53.4pt;height:0;z-index:251744256;visibility:visible;mso-wrap-style:square;mso-width-percent:0;mso-height-percent:0;mso-wrap-distance-left:9pt;mso-wrap-distance-top:0;mso-wrap-distance-right:9pt;mso-wrap-distance-bottom:0;mso-position-horizontal:absolute;mso-position-horizontal-relative:text;mso-position-vertical:absolute;mso-position-vertical-relative:text;mso-width-percent:0;mso-height-percent:0;mso-width-relative:margin;mso-height-relative:margin" o:gfxdata="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" strokecolor="black [3200]" strokeweight="1.5pt">
+              <v:shape w14:anchorId="0AB94C3E" id="Straight Arrow Connector 5" o:spid="_x0000_s1026" type="#_x0000_t32" style="position:absolute;margin-left:5in;margin-top:6.4pt;width:53.4pt;height:0;z-index:251744256;visibility:visible;mso-wrap-style:square;mso-width-percent:0;mso-height-percent:0;mso-wrap-distance-left:9pt;mso-wrap-distance-top:0;mso-wrap-distance-right:9pt;mso-wrap-distance-bottom:0;mso-position-horizontal:absolute;mso-position-horizontal-relative:text;mso-position-vertical:absolute;mso-position-vertical-relative:text;mso-width-percent:0;mso-height-percent:0;mso-width-relative:margin;mso-height-relative:margin" o:gfxdata="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" strokecolor="black [3200]" strokeweight="1.5pt">
                 <v:stroke endarrow="block" joinstyle="miter"/>
               </v:shape>
             </w:pict>
@@ -4591,7 +4590,7 @@
           </mc:Choice>
           <mc:Fallback>
             <w:pict>
-              <v:shape w14:anchorId="33BF2A4E" id="Straight Arrow Connector 5" o:spid="_x0000_s1026" type="#_x0000_t32" style="position:absolute;margin-left:253.2pt;margin-top:5.8pt;width:53.4pt;height:0;z-index:251689984;visibility:visible;mso-wrap-style:square;mso-width-percent:0;mso-height-percent:0;mso-wrap-distance-left:9pt;mso-wrap-distance-top:0;mso-wrap-distance-right:9pt;mso-wrap-distance-bottom:0;mso-position-horizontal:absolute;mso-position-horizontal-relative:text;mso-position-vertical:absolute;mso-position-vertical-relative:text;mso-width-percent:0;mso-height-percent:0;mso-width-relative:margin;mso-height-relative:margin" o:gfxdata="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" strokecolor="black [3200]" strokeweight="1.5pt">
+              <v:shape w14:anchorId="0EC68B02" id="Straight Arrow Connector 5" o:spid="_x0000_s1026" type="#_x0000_t32" style="position:absolute;margin-left:253.2pt;margin-top:5.8pt;width:53.4pt;height:0;z-index:251689984;visibility:visible;mso-wrap-style:square;mso-width-percent:0;mso-height-percent:0;mso-wrap-distance-left:9pt;mso-wrap-distance-top:0;mso-wrap-distance-right:9pt;mso-wrap-distance-bottom:0;mso-position-horizontal:absolute;mso-position-horizontal-relative:text;mso-position-vertical:absolute;mso-position-vertical-relative:text;mso-width-percent:0;mso-height-percent:0;mso-width-relative:margin;mso-height-relative:margin" o:gfxdata="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" strokecolor="black [3200]" strokeweight="1.5pt">
                 <v:stroke endarrow="block" joinstyle="miter"/>
               </v:shape>
             </w:pict>
@@ -4666,7 +4665,7 @@
           </mc:Choice>
           <mc:Fallback>
             <w:pict>
-              <v:shape w14:anchorId="4CED2C77" id="Straight Arrow Connector 5" o:spid="_x0000_s1026" type="#_x0000_t32" style="position:absolute;margin-left:151.2pt;margin-top:5.8pt;width:53.4pt;height:0;z-index:251631616;visibility:visible;mso-wrap-style:square;mso-width-percent:0;mso-height-percent:0;mso-wrap-distance-left:9pt;mso-wrap-distance-top:0;mso-wrap-distance-right:9pt;mso-wrap-distance-bottom:0;mso-position-horizontal:absolute;mso-position-horizontal-relative:text;mso-position-vertical:absolute;mso-position-vertical-relative:text;mso-width-percent:0;mso-height-percent:0;mso-width-relative:margin;mso-height-relative:margin" o:gfxdata="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" strokecolor="black [3200]" strokeweight="1.5pt">
+              <v:shape w14:anchorId="6DE1D5E7" id="Straight Arrow Connector 5" o:spid="_x0000_s1026" type="#_x0000_t32" style="position:absolute;margin-left:151.2pt;margin-top:5.8pt;width:53.4pt;height:0;z-index:251631616;visibility:visible;mso-wrap-style:square;mso-width-percent:0;mso-height-percent:0;mso-wrap-distance-left:9pt;mso-wrap-distance-top:0;mso-wrap-distance-right:9pt;mso-wrap-distance-bottom:0;mso-position-horizontal:absolute;mso-position-horizontal-relative:text;mso-position-vertical:absolute;mso-position-vertical-relative:text;mso-width-percent:0;mso-height-percent:0;mso-width-relative:margin;mso-height-relative:margin" o:gfxdata="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" strokecolor="black [3200]" strokeweight="1.5pt">
                 <v:stroke endarrow="block" joinstyle="miter"/>
               </v:shape>
             </w:pict>
@@ -4741,7 +4740,7 @@
           </mc:Choice>
           <mc:Fallback>
             <w:pict>
-              <v:shape w14:anchorId="76D52864" id="Straight Arrow Connector 5" o:spid="_x0000_s1026" type="#_x0000_t32" style="position:absolute;margin-left:101.4pt;margin-top:8.8pt;width:14.4pt;height:23.4pt;flip:x;z-index:251571200;visibility:visible;mso-wrap-style:square;mso-width-percent:0;mso-height-percent:0;mso-wrap-distance-left:9pt;mso-wrap-distance-top:0;mso-wrap-distance-right:9pt;mso-wrap-distance-bottom:0;mso-position-horizontal:absolute;mso-position-horizontal-relative:text;mso-position-vertical:absolute;mso-position-vertical-relative:text;mso-width-percent:0;mso-height-percent:0;mso-width-relative:margin;mso-height-relative:margin" o:gfxdata="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" strokecolor="black [3200]" strokeweight="1.5pt">
+              <v:shape w14:anchorId="2956D35F" id="Straight Arrow Connector 5" o:spid="_x0000_s1026" type="#_x0000_t32" style="position:absolute;margin-left:101.4pt;margin-top:8.8pt;width:14.4pt;height:23.4pt;flip:x;z-index:251571200;visibility:visible;mso-wrap-style:square;mso-width-percent:0;mso-height-percent:0;mso-wrap-distance-left:9pt;mso-wrap-distance-top:0;mso-wrap-distance-right:9pt;mso-wrap-distance-bottom:0;mso-position-horizontal:absolute;mso-position-horizontal-relative:text;mso-position-vertical:absolute;mso-position-vertical-relative:text;mso-width-percent:0;mso-height-percent:0;mso-width-relative:margin;mso-height-relative:margin" o:gfxdata="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" strokecolor="black [3200]" strokeweight="1.5pt">
                 <v:stroke endarrow="block" joinstyle="miter"/>
               </v:shape>
             </w:pict>
@@ -4816,7 +4815,7 @@
           </mc:Choice>
           <mc:Fallback>
             <w:pict>
-              <v:shape w14:anchorId="6C47264B" id="Straight Arrow Connector 5" o:spid="_x0000_s1026" type="#_x0000_t32" style="position:absolute;margin-left:47.4pt;margin-top:6pt;width:53.4pt;height:0;z-index:251449344;visibility:visible;mso-wrap-style:square;mso-width-percent:0;mso-height-percent:0;mso-wrap-distance-left:9pt;mso-wrap-distance-top:0;mso-wrap-distance-right:9pt;mso-wrap-distance-bottom:0;mso-position-horizontal:absolute;mso-position-horizontal-relative:text;mso-position-vertical:absolute;mso-position-vertical-relative:text;mso-width-percent:0;mso-height-percent:0;mso-width-relative:margin;mso-height-relative:margin" o:gfxdata="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" strokecolor="black [3200]" strokeweight="1.5pt">
+              <v:shape w14:anchorId="032CFDCE" id="Straight Arrow Connector 5" o:spid="_x0000_s1026" type="#_x0000_t32" style="position:absolute;margin-left:47.4pt;margin-top:6pt;width:53.4pt;height:0;z-index:251449344;visibility:visible;mso-wrap-style:square;mso-width-percent:0;mso-height-percent:0;mso-wrap-distance-left:9pt;mso-wrap-distance-top:0;mso-wrap-distance-right:9pt;mso-wrap-distance-bottom:0;mso-position-horizontal:absolute;mso-position-horizontal-relative:text;mso-position-vertical:absolute;mso-position-vertical-relative:text;mso-width-percent:0;mso-height-percent:0;mso-width-relative:margin;mso-height-relative:margin" o:gfxdata="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" strokecolor="black [3200]" strokeweight="1.5pt">
                 <v:stroke endarrow="block" joinstyle="miter"/>
               </v:shape>
             </w:pict>
@@ -5030,7 +5029,7 @@
           </mc:Choice>
           <mc:Fallback>
             <w:pict>
-              <v:rect w14:anchorId="5E6D74C6" id="Rectangle 3" o:spid="_x0000_s1026" style="position:absolute;margin-left:166.2pt;margin-top:2pt;width:59.4pt;height:28.8pt;z-index:251599872;visibility:visible;mso-wrap-style:square;mso-width-percent:0;mso-height-percent:0;mso-wrap-distance-left:9pt;mso-wrap-distance-top:0;mso-wrap-distance-right:9pt;mso-wrap-distance-bottom:0;mso-position-horizontal:absolute;mso-position-horizontal-relative:text;mso-position-vertical:absolute;mso-position-vertical-relative:text;mso-width-percent:0;mso-height-percent:0;mso-width-relative:margin;mso-height-relative:margin;v-text-anchor:middle" o:gfxdata="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" filled="f" strokecolor="black [3213]" strokeweight="1.5pt"/>
+              <v:rect w14:anchorId="54104720" id="Rectangle 3" o:spid="_x0000_s1026" style="position:absolute;margin-left:166.2pt;margin-top:2pt;width:59.4pt;height:28.8pt;z-index:251599872;visibility:visible;mso-wrap-style:square;mso-width-percent:0;mso-height-percent:0;mso-wrap-distance-left:9pt;mso-wrap-distance-top:0;mso-wrap-distance-right:9pt;mso-wrap-distance-bottom:0;mso-position-horizontal:absolute;mso-position-horizontal-relative:text;mso-position-vertical:absolute;mso-position-vertical-relative:text;mso-width-percent:0;mso-height-percent:0;mso-width-relative:margin;mso-height-relative:margin;v-text-anchor:middle" o:gfxdata="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" filled="f" strokecolor="black [3213]" strokeweight="1.5pt"/>
             </w:pict>
           </mc:Fallback>
         </mc:AlternateContent>
@@ -5102,7 +5101,7 @@
           </mc:Choice>
           <mc:Fallback>
             <w:pict>
-              <v:line w14:anchorId="3573AE62" id="Straight Connector 4" o:spid="_x0000_s1026" style="position:absolute;z-index:251621376;visibility:visible;mso-wrap-style:square;mso-height-percent:0;mso-wrap-distance-left:9pt;mso-wrap-distance-top:0;mso-wrap-distance-right:9pt;mso-wrap-distance-bottom:0;mso-position-horizontal:absolute;mso-position-horizontal-relative:text;mso-position-vertical:absolute;mso-position-vertical-relative:text;mso-height-percent:0;mso-height-relative:margin" from="196.8pt,2pt" to="196.8pt,30.8pt" o:gfxdata="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" strokecolor="black [3213]" strokeweight="1.5pt">
+              <v:line w14:anchorId="02F743C3" id="Straight Connector 4" o:spid="_x0000_s1026" style="position:absolute;z-index:251621376;visibility:visible;mso-wrap-style:square;mso-height-percent:0;mso-wrap-distance-left:9pt;mso-wrap-distance-top:0;mso-wrap-distance-right:9pt;mso-wrap-distance-bottom:0;mso-position-horizontal:absolute;mso-position-horizontal-relative:text;mso-position-vertical:absolute;mso-position-vertical-relative:text;mso-height-percent:0;mso-height-relative:margin" from="196.8pt,2pt" to="196.8pt,30.8pt" o:gfxdata="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" strokecolor="black [3213]" strokeweight="1.5pt">
                 <v:stroke joinstyle="miter"/>
               </v:line>
             </w:pict>
@@ -5187,7 +5186,7 @@
           </mc:Choice>
           <mc:Fallback>
             <w:pict>
-              <v:rect w14:anchorId="1029B34A" id="Rectangle 3" o:spid="_x0000_s1026" style="position:absolute;margin-left:69pt;margin-top:2.2pt;width:59.4pt;height:28.8pt;z-index:251534336;visibility:visible;mso-wrap-style:square;mso-width-percent:0;mso-height-percent:0;mso-wrap-distance-left:9pt;mso-wrap-distance-top:0;mso-wrap-distance-right:9pt;mso-wrap-distance-bottom:0;mso-position-horizontal:absolute;mso-position-horizontal-relative:text;mso-position-vertical:absolute;mso-position-vertical-relative:text;mso-width-percent:0;mso-height-percent:0;mso-width-relative:margin;mso-height-relative:margin;v-text-anchor:middle" o:gfxdata="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" filled="f" strokecolor="black [3213]" strokeweight="1.5pt"/>
+              <v:rect w14:anchorId="5E0103A2" id="Rectangle 3" o:spid="_x0000_s1026" style="position:absolute;margin-left:69pt;margin-top:2.2pt;width:59.4pt;height:28.8pt;z-index:251534336;visibility:visible;mso-wrap-style:square;mso-width-percent:0;mso-height-percent:0;mso-wrap-distance-left:9pt;mso-wrap-distance-top:0;mso-wrap-distance-right:9pt;mso-wrap-distance-bottom:0;mso-position-horizontal:absolute;mso-position-horizontal-relative:text;mso-position-vertical:absolute;mso-position-vertical-relative:text;mso-width-percent:0;mso-height-percent:0;mso-width-relative:margin;mso-height-relative:margin;v-text-anchor:middle" o:gfxdata="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" filled="f" strokecolor="black [3213]" strokeweight="1.5pt"/>
             </w:pict>
           </mc:Fallback>
         </mc:AlternateContent>
@@ -5259,7 +5258,7 @@
           </mc:Choice>
           <mc:Fallback>
             <w:pict>
-              <v:line w14:anchorId="0A2C73AB" id="Straight Connector 4" o:spid="_x0000_s1026" style="position:absolute;z-index:251557888;visibility:visible;mso-wrap-style:square;mso-height-percent:0;mso-wrap-distance-left:9pt;mso-wrap-distance-top:0;mso-wrap-distance-right:9pt;mso-wrap-distance-bottom:0;mso-position-horizontal:absolute;mso-position-horizontal-relative:text;mso-position-vertical:absolute;mso-position-vertical-relative:text;mso-height-percent:0;mso-height-relative:margin" from="99.6pt,2.2pt" to="99.6pt,31pt" o:gfxdata="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" strokecolor="black [3213]" strokeweight="1.5pt">
+              <v:line w14:anchorId="0805F122" id="Straight Connector 4" o:spid="_x0000_s1026" style="position:absolute;z-index:251557888;visibility:visible;mso-wrap-style:square;mso-height-percent:0;mso-wrap-distance-left:9pt;mso-wrap-distance-top:0;mso-wrap-distance-right:9pt;mso-wrap-distance-bottom:0;mso-position-horizontal:absolute;mso-position-horizontal-relative:text;mso-position-vertical:absolute;mso-position-vertical-relative:text;mso-height-percent:0;mso-height-relative:margin" from="99.6pt,2.2pt" to="99.6pt,31pt" o:gfxdata="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" strokecolor="black [3213]" strokeweight="1.5pt">
                 <v:stroke joinstyle="miter"/>
               </v:line>
             </w:pict>
@@ -5344,7 +5343,7 @@
           </mc:Choice>
           <mc:Fallback>
             <w:pict>
-              <v:shape w14:anchorId="084C7976" id="Straight Arrow Connector 5" o:spid="_x0000_s1026" type="#_x0000_t32" style="position:absolute;margin-left:209.4pt;margin-top:6.6pt;width:53.4pt;height:0;z-index:251625472;visibility:visible;mso-wrap-style:square;mso-width-percent:0;mso-height-percent:0;mso-wrap-distance-left:9pt;mso-wrap-distance-top:0;mso-wrap-distance-right:9pt;mso-wrap-distance-bottom:0;mso-position-horizontal:absolute;mso-position-horizontal-relative:text;mso-position-vertical:absolute;mso-position-vertical-relative:text;mso-width-percent:0;mso-height-percent:0;mso-width-relative:margin;mso-height-relative:margin" o:gfxdata="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" strokecolor="black [3200]" strokeweight="1.5pt">
+              <v:shape w14:anchorId="5C826C19" id="Straight Arrow Connector 5" o:spid="_x0000_s1026" type="#_x0000_t32" style="position:absolute;margin-left:209.4pt;margin-top:6.6pt;width:53.4pt;height:0;z-index:251625472;visibility:visible;mso-wrap-style:square;mso-width-percent:0;mso-height-percent:0;mso-wrap-distance-left:9pt;mso-wrap-distance-top:0;mso-wrap-distance-right:9pt;mso-wrap-distance-bottom:0;mso-position-horizontal:absolute;mso-position-horizontal-relative:text;mso-position-vertical:absolute;mso-position-vertical-relative:text;mso-width-percent:0;mso-height-percent:0;mso-width-relative:margin;mso-height-relative:margin" o:gfxdata="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" strokecolor="black [3200]" strokeweight="1.5pt">
                 <v:stroke endarrow="block" joinstyle="miter"/>
               </v:shape>
             </w:pict>
@@ -5419,7 +5418,7 @@
           </mc:Choice>
           <mc:Fallback>
             <w:pict>
-              <v:shape w14:anchorId="4CDFE565" id="Straight Arrow Connector 5" o:spid="_x0000_s1026" type="#_x0000_t32" style="position:absolute;margin-left:112.8pt;margin-top:6.6pt;width:53.4pt;height:0;z-index:251578368;visibility:visible;mso-wrap-style:square;mso-width-percent:0;mso-height-percent:0;mso-wrap-distance-left:9pt;mso-wrap-distance-top:0;mso-wrap-distance-right:9pt;mso-wrap-distance-bottom:0;mso-position-horizontal:absolute;mso-position-horizontal-relative:text;mso-position-vertical:absolute;mso-position-vertical-relative:text;mso-width-percent:0;mso-height-percent:0;mso-width-relative:margin;mso-height-relative:margin" o:gfxdata="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" strokecolor="black [3200]" strokeweight="1.5pt">
+              <v:shape w14:anchorId="1D9AF6C9" id="Straight Arrow Connector 5" o:spid="_x0000_s1026" type="#_x0000_t32" style="position:absolute;margin-left:112.8pt;margin-top:6.6pt;width:53.4pt;height:0;z-index:251578368;visibility:visible;mso-wrap-style:square;mso-width-percent:0;mso-height-percent:0;mso-wrap-distance-left:9pt;mso-wrap-distance-top:0;mso-wrap-distance-right:9pt;mso-wrap-distance-bottom:0;mso-position-horizontal:absolute;mso-position-horizontal-relative:text;mso-position-vertical:absolute;mso-position-vertical-relative:text;mso-width-percent:0;mso-height-percent:0;mso-width-relative:margin;mso-height-relative:margin" o:gfxdata="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" strokecolor="black [3200]" strokeweight="1.5pt">
                 <v:stroke endarrow="block" joinstyle="miter"/>
               </v:shape>
             </w:pict>
@@ -5579,7 +5578,7 @@
           </mc:Choice>
           <mc:Fallback>
             <w:pict>
-              <v:line w14:anchorId="2E8C2C9E" id="Straight Connector 4" o:spid="_x0000_s1026" style="position:absolute;z-index:252531712;visibility:visible;mso-wrap-style:square;mso-height-percent:0;mso-wrap-distance-left:9pt;mso-wrap-distance-top:0;mso-wrap-distance-right:9pt;mso-wrap-distance-bottom:0;mso-position-horizontal:absolute;mso-position-horizontal-relative:text;mso-position-vertical:absolute;mso-position-vertical-relative:text;mso-height-percent:0;mso-height-relative:margin" from="495pt,16.05pt" to="495pt,44.85pt" o:gfxdata="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" strokecolor="black [3213]" strokeweight="1.5pt">
+              <v:line w14:anchorId="00F3953E" id="Straight Connector 4" o:spid="_x0000_s1026" style="position:absolute;z-index:252531712;visibility:visible;mso-wrap-style:square;mso-height-percent:0;mso-wrap-distance-left:9pt;mso-wrap-distance-top:0;mso-wrap-distance-right:9pt;mso-wrap-distance-bottom:0;mso-position-horizontal:absolute;mso-position-horizontal-relative:text;mso-position-vertical:absolute;mso-position-vertical-relative:text;mso-height-percent:0;mso-height-relative:margin" from="495pt,16.05pt" to="495pt,44.85pt" o:gfxdata="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" strokecolor="black [3213]" strokeweight="1.5pt">
                 <v:stroke joinstyle="miter"/>
               </v:line>
             </w:pict>
@@ -5680,7 +5679,7 @@
           </mc:Choice>
           <mc:Fallback>
             <w:pict>
-              <v:rect w14:anchorId="136E3A16" id="Rectangle 3" o:spid="_x0000_s1026" style="position:absolute;margin-left:464.4pt;margin-top:3.6pt;width:59.4pt;height:28.8pt;z-index:252512256;visibility:visible;mso-wrap-style:square;mso-width-percent:0;mso-height-percent:0;mso-wrap-distance-left:9pt;mso-wrap-distance-top:0;mso-wrap-distance-right:9pt;mso-wrap-distance-bottom:0;mso-position-horizontal:absolute;mso-position-horizontal-relative:text;mso-position-vertical:absolute;mso-position-vertical-relative:text;mso-width-percent:0;mso-height-percent:0;mso-width-relative:margin;mso-height-relative:margin;v-text-anchor:middle" o:gfxdata="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" filled="f" strokecolor="black [3213]" strokeweight="1.5pt"/>
+              <v:rect w14:anchorId="03C1F271" id="Rectangle 3" o:spid="_x0000_s1026" style="position:absolute;margin-left:464.4pt;margin-top:3.6pt;width:59.4pt;height:28.8pt;z-index:252512256;visibility:visible;mso-wrap-style:square;mso-width-percent:0;mso-height-percent:0;mso-wrap-distance-left:9pt;mso-wrap-distance-top:0;mso-wrap-distance-right:9pt;mso-wrap-distance-bottom:0;mso-position-horizontal:absolute;mso-position-horizontal-relative:text;mso-position-vertical:absolute;mso-position-vertical-relative:text;mso-width-percent:0;mso-height-percent:0;mso-width-relative:margin;mso-height-relative:margin;v-text-anchor:middle" o:gfxdata="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" filled="f" strokecolor="black [3213]" strokeweight="1.5pt"/>
             </w:pict>
           </mc:Fallback>
         </mc:AlternateContent>
@@ -5763,7 +5762,7 @@
           </mc:Choice>
           <mc:Fallback>
             <w:pict>
-              <v:rect w14:anchorId="76BC7172" id="Rectangle 3" o:spid="_x0000_s1026" style="position:absolute;margin-left:71.4pt;margin-top:1.45pt;width:59.4pt;height:28.8pt;z-index:252295168;visibility:visible;mso-wrap-style:square;mso-width-percent:0;mso-height-percent:0;mso-wrap-distance-left:9pt;mso-wrap-distance-top:0;mso-wrap-distance-right:9pt;mso-wrap-distance-bottom:0;mso-position-horizontal:absolute;mso-position-horizontal-relative:text;mso-position-vertical:absolute;mso-position-vertical-relative:text;mso-width-percent:0;mso-height-percent:0;mso-width-relative:margin;mso-height-relative:margin;v-text-anchor:middle" o:gfxdata="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" filled="f" strokecolor="black [3213]" strokeweight="1.5pt"/>
+              <v:rect w14:anchorId="6D2ACD84" id="Rectangle 3" o:spid="_x0000_s1026" style="position:absolute;margin-left:71.4pt;margin-top:1.45pt;width:59.4pt;height:28.8pt;z-index:252295168;visibility:visible;mso-wrap-style:square;mso-width-percent:0;mso-height-percent:0;mso-wrap-distance-left:9pt;mso-wrap-distance-top:0;mso-wrap-distance-right:9pt;mso-wrap-distance-bottom:0;mso-position-horizontal:absolute;mso-position-horizontal-relative:text;mso-position-vertical:absolute;mso-position-vertical-relative:text;mso-width-percent:0;mso-height-percent:0;mso-width-relative:margin;mso-height-relative:margin;v-text-anchor:middle" o:gfxdata="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" filled="f" strokecolor="black [3213]" strokeweight="1.5pt"/>
             </w:pict>
           </mc:Fallback>
         </mc:AlternateContent>
@@ -5835,7 +5834,7 @@
           </mc:Choice>
           <mc:Fallback>
             <w:pict>
-              <v:line w14:anchorId="64FDC65B" id="Straight Connector 4" o:spid="_x0000_s1026" style="position:absolute;z-index:252346368;visibility:visible;mso-wrap-style:square;mso-height-percent:0;mso-wrap-distance-left:9pt;mso-wrap-distance-top:0;mso-wrap-distance-right:9pt;mso-wrap-distance-bottom:0;mso-position-horizontal:absolute;mso-position-horizontal-relative:text;mso-position-vertical:absolute;mso-position-vertical-relative:text;mso-height-percent:0;mso-height-relative:margin" from="102pt,1.45pt" to="102pt,30.25pt" o:gfxdata="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" strokecolor="black [3213]" strokeweight="1.5pt">
+              <v:line w14:anchorId="19079F7E" id="Straight Connector 4" o:spid="_x0000_s1026" style="position:absolute;z-index:252346368;visibility:visible;mso-wrap-style:square;mso-height-percent:0;mso-wrap-distance-left:9pt;mso-wrap-distance-top:0;mso-wrap-distance-right:9pt;mso-wrap-distance-bottom:0;mso-position-horizontal:absolute;mso-position-horizontal-relative:text;mso-position-vertical:absolute;mso-position-vertical-relative:text;mso-height-percent:0;mso-height-relative:margin" from="102pt,1.45pt" to="102pt,30.25pt" o:gfxdata="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" strokecolor="black [3213]" strokeweight="1.5pt">
                 <v:stroke joinstyle="miter"/>
               </v:line>
             </w:pict>
@@ -5920,7 +5919,7 @@
           </mc:Choice>
           <mc:Fallback>
             <w:pict>
-              <v:rect w14:anchorId="6CDF172C" id="Rectangle 3" o:spid="_x0000_s1026" style="position:absolute;margin-left:-36pt;margin-top:2.65pt;width:59.4pt;height:28.8pt;z-index:252209152;visibility:visible;mso-wrap-style:square;mso-width-percent:0;mso-height-percent:0;mso-wrap-distance-left:9pt;mso-wrap-distance-top:0;mso-wrap-distance-right:9pt;mso-wrap-distance-bottom:0;mso-position-horizontal:absolute;mso-position-horizontal-relative:text;mso-position-vertical:absolute;mso-position-vertical-relative:text;mso-width-percent:0;mso-height-percent:0;mso-width-relative:margin;mso-height-relative:margin;v-text-anchor:middle" o:gfxdata="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" filled="f" strokecolor="black [3213]" strokeweight="1.5pt"/>
+              <v:rect w14:anchorId="12697854" id="Rectangle 3" o:spid="_x0000_s1026" style="position:absolute;margin-left:-36pt;margin-top:2.65pt;width:59.4pt;height:28.8pt;z-index:252209152;visibility:visible;mso-wrap-style:square;mso-width-percent:0;mso-height-percent:0;mso-wrap-distance-left:9pt;mso-wrap-distance-top:0;mso-wrap-distance-right:9pt;mso-wrap-distance-bottom:0;mso-position-horizontal:absolute;mso-position-horizontal-relative:text;mso-position-vertical:absolute;mso-position-vertical-relative:text;mso-width-percent:0;mso-height-percent:0;mso-width-relative:margin;mso-height-relative:margin;v-text-anchor:middle" o:gfxdata="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" filled="f" strokecolor="black [3213]" strokeweight="1.5pt"/>
             </w:pict>
           </mc:Fallback>
         </mc:AlternateContent>
@@ -5992,7 +5991,7 @@
           </mc:Choice>
           <mc:Fallback>
             <w:pict>
-              <v:line w14:anchorId="50595B2B" id="Straight Connector 4" o:spid="_x0000_s1026" style="position:absolute;z-index:252490752;visibility:visible;mso-wrap-style:square;mso-height-percent:0;mso-wrap-distance-left:9pt;mso-wrap-distance-top:0;mso-wrap-distance-right:9pt;mso-wrap-distance-bottom:0;mso-position-horizontal:absolute;mso-position-horizontal-relative:text;mso-position-vertical:absolute;mso-position-vertical-relative:text;mso-height-percent:0;mso-height-relative:margin" from="414pt,2.4pt" to="414pt,31.2pt" o:gfxdata="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" strokecolor="black [3213]" strokeweight="1.5pt">
+              <v:line w14:anchorId="45797C4E" id="Straight Connector 4" o:spid="_x0000_s1026" style="position:absolute;z-index:252490752;visibility:visible;mso-wrap-style:square;mso-height-percent:0;mso-wrap-distance-left:9pt;mso-wrap-distance-top:0;mso-wrap-distance-right:9pt;mso-wrap-distance-bottom:0;mso-position-horizontal:absolute;mso-position-horizontal-relative:text;mso-position-vertical:absolute;mso-position-vertical-relative:text;mso-height-percent:0;mso-height-relative:margin" from="414pt,2.4pt" to="414pt,31.2pt" o:gfxdata="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" strokecolor="black [3213]" strokeweight="1.5pt">
                 <v:stroke joinstyle="miter"/>
               </v:line>
             </w:pict>
@@ -6077,7 +6076,7 @@
           </mc:Choice>
           <mc:Fallback>
             <w:pict>
-              <v:rect w14:anchorId="28D65373" id="Rectangle 3" o:spid="_x0000_s1026" style="position:absolute;margin-left:279pt;margin-top:1.8pt;width:59.4pt;height:28.8pt;z-index:251980800;visibility:visible;mso-wrap-style:square;mso-width-percent:0;mso-height-percent:0;mso-wrap-distance-left:9pt;mso-wrap-distance-top:0;mso-wrap-distance-right:9pt;mso-wrap-distance-bottom:0;mso-position-horizontal:absolute;mso-position-horizontal-relative:text;mso-position-vertical:absolute;mso-position-vertical-relative:text;mso-width-percent:0;mso-height-percent:0;mso-width-relative:margin;mso-height-relative:margin;v-text-anchor:middle" o:gfxdata="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" filled="f" strokecolor="black [3213]" strokeweight="1.5pt"/>
+              <v:rect w14:anchorId="32F6F22E" id="Rectangle 3" o:spid="_x0000_s1026" style="position:absolute;margin-left:279pt;margin-top:1.8pt;width:59.4pt;height:28.8pt;z-index:251980800;visibility:visible;mso-wrap-style:square;mso-width-percent:0;mso-height-percent:0;mso-wrap-distance-left:9pt;mso-wrap-distance-top:0;mso-wrap-distance-right:9pt;mso-wrap-distance-bottom:0;mso-position-horizontal:absolute;mso-position-horizontal-relative:text;mso-position-vertical:absolute;mso-position-vertical-relative:text;mso-width-percent:0;mso-height-percent:0;mso-width-relative:margin;mso-height-relative:margin;v-text-anchor:middle" o:gfxdata="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" filled="f" strokecolor="black [3213]" strokeweight="1.5pt"/>
             </w:pict>
           </mc:Fallback>
         </mc:AlternateContent>
@@ -6149,7 +6148,7 @@
           </mc:Choice>
           <mc:Fallback>
             <w:pict>
-              <v:line w14:anchorId="7A0DCDB6" id="Straight Connector 4" o:spid="_x0000_s1026" style="position:absolute;z-index:252052480;visibility:visible;mso-wrap-style:square;mso-height-percent:0;mso-wrap-distance-left:9pt;mso-wrap-distance-top:0;mso-wrap-distance-right:9pt;mso-wrap-distance-bottom:0;mso-position-horizontal:absolute;mso-position-horizontal-relative:text;mso-position-vertical:absolute;mso-position-vertical-relative:text;mso-height-percent:0;mso-height-relative:margin" from="309.6pt,1.8pt" to="309.6pt,30.6pt" o:gfxdata="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" strokecolor="black [3213]" strokeweight="1.5pt">
+              <v:line w14:anchorId="2A18D435" id="Straight Connector 4" o:spid="_x0000_s1026" style="position:absolute;z-index:252052480;visibility:visible;mso-wrap-style:square;mso-height-percent:0;mso-wrap-distance-left:9pt;mso-wrap-distance-top:0;mso-wrap-distance-right:9pt;mso-wrap-distance-bottom:0;mso-position-horizontal:absolute;mso-position-horizontal-relative:text;mso-position-vertical:absolute;mso-position-vertical-relative:text;mso-height-percent:0;mso-height-relative:margin" from="309.6pt,1.8pt" to="309.6pt,30.6pt" o:gfxdata="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" strokecolor="black [3213]" strokeweight="1.5pt">
                 <v:stroke joinstyle="miter"/>
               </v:line>
             </w:pict>
@@ -6234,7 +6233,7 @@
           </mc:Choice>
           <mc:Fallback>
             <w:pict>
-              <v:rect w14:anchorId="7E070FAC" id="Rectangle 3" o:spid="_x0000_s1026" style="position:absolute;margin-left:174.6pt;margin-top:2.65pt;width:59.4pt;height:28.8pt;z-index:252386304;visibility:visible;mso-wrap-style:square;mso-width-percent:0;mso-height-percent:0;mso-wrap-distance-left:9pt;mso-wrap-distance-top:0;mso-wrap-distance-right:9pt;mso-wrap-distance-bottom:0;mso-position-horizontal:absolute;mso-position-horizontal-relative:text;mso-position-vertical:absolute;mso-position-vertical-relative:text;mso-width-percent:0;mso-height-percent:0;mso-width-relative:margin;mso-height-relative:margin;v-text-anchor:middle" o:gfxdata="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" filled="f" strokecolor="black [3213]" strokeweight="1.5pt"/>
+              <v:rect w14:anchorId="410AE60A" id="Rectangle 3" o:spid="_x0000_s1026" style="position:absolute;margin-left:174.6pt;margin-top:2.65pt;width:59.4pt;height:28.8pt;z-index:252386304;visibility:visible;mso-wrap-style:square;mso-width-percent:0;mso-height-percent:0;mso-wrap-distance-left:9pt;mso-wrap-distance-top:0;mso-wrap-distance-right:9pt;mso-wrap-distance-bottom:0;mso-position-horizontal:absolute;mso-position-horizontal-relative:text;mso-position-vertical:absolute;mso-position-vertical-relative:text;mso-width-percent:0;mso-height-percent:0;mso-width-relative:margin;mso-height-relative:margin;v-text-anchor:middle" o:gfxdata="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" filled="f" strokecolor="black [3213]" strokeweight="1.5pt"/>
             </w:pict>
           </mc:Fallback>
         </mc:AlternateContent>
@@ -6309,7 +6308,7 @@
           </mc:Choice>
           <mc:Fallback>
             <w:pict>
-              <v:line w14:anchorId="03609222" id="Straight Connector 4" o:spid="_x0000_s1026" style="position:absolute;z-index:252426240;visibility:visible;mso-wrap-style:square;mso-width-percent:0;mso-height-percent:0;mso-wrap-distance-left:9pt;mso-wrap-distance-top:0;mso-wrap-distance-right:9pt;mso-wrap-distance-bottom:0;mso-position-horizontal:absolute;mso-position-horizontal-relative:text;mso-position-vertical:absolute;mso-position-vertical-relative:text;mso-width-percent:0;mso-height-percent:0;mso-width-relative:margin;mso-height-relative:margin" from="205.2pt,2.65pt" to="205.2pt,31.45pt" o:gfxdata="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" strokecolor="black [3213]" strokeweight="1.5pt">
+              <v:line w14:anchorId="544775AD" id="Straight Connector 4" o:spid="_x0000_s1026" style="position:absolute;z-index:252426240;visibility:visible;mso-wrap-style:square;mso-width-percent:0;mso-height-percent:0;mso-wrap-distance-left:9pt;mso-wrap-distance-top:0;mso-wrap-distance-right:9pt;mso-wrap-distance-bottom:0;mso-position-horizontal:absolute;mso-position-horizontal-relative:text;mso-position-vertical:absolute;mso-position-vertical-relative:text;mso-width-percent:0;mso-height-percent:0;mso-width-relative:margin;mso-height-relative:margin" from="205.2pt,2.65pt" to="205.2pt,31.45pt" o:gfxdata="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" strokecolor="black [3213]" strokeweight="1.5pt">
                 <v:stroke joinstyle="miter"/>
               </v:line>
             </w:pict>
@@ -6383,7 +6382,7 @@
           </mc:Choice>
           <mc:Fallback>
             <w:pict>
-              <v:line w14:anchorId="7C34603E" id="Straight Connector 4" o:spid="_x0000_s1026" style="position:absolute;z-index:252243968;visibility:visible;mso-wrap-style:square;mso-height-percent:0;mso-wrap-distance-left:9pt;mso-wrap-distance-top:0;mso-wrap-distance-right:9pt;mso-wrap-distance-bottom:0;mso-position-horizontal:absolute;mso-position-horizontal-relative:text;mso-position-vertical:absolute;mso-position-vertical-relative:text;mso-height-percent:0;mso-height-relative:margin" from="-5.4pt,2.65pt" to="-5.4pt,31.45pt" o:gfxdata="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" strokecolor="black [3213]" strokeweight="1.5pt">
+              <v:line w14:anchorId="278D2EC3" id="Straight Connector 4" o:spid="_x0000_s1026" style="position:absolute;z-index:252243968;visibility:visible;mso-wrap-style:square;mso-height-percent:0;mso-wrap-distance-left:9pt;mso-wrap-distance-top:0;mso-wrap-distance-right:9pt;mso-wrap-distance-bottom:0;mso-position-horizontal:absolute;mso-position-horizontal-relative:text;mso-position-vertical:absolute;mso-position-vertical-relative:text;mso-height-percent:0;mso-height-relative:margin" from="-5.4pt,2.65pt" to="-5.4pt,31.45pt" o:gfxdata="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" strokecolor="black [3213]" strokeweight="1.5pt">
                 <v:stroke joinstyle="miter"/>
               </v:line>
             </w:pict>
@@ -6458,7 +6457,7 @@
           </mc:Choice>
           <mc:Fallback>
             <w:pict>
-              <v:shape w14:anchorId="669A243C" id="Straight Arrow Connector 5" o:spid="_x0000_s1026" type="#_x0000_t32" style="position:absolute;margin-left:18pt;margin-top:16.6pt;width:53.4pt;height:0;z-index:251773952;visibility:visible;mso-wrap-style:square;mso-width-percent:0;mso-height-percent:0;mso-wrap-distance-left:9pt;mso-wrap-distance-top:0;mso-wrap-distance-right:9pt;mso-wrap-distance-bottom:0;mso-position-horizontal:absolute;mso-position-horizontal-relative:text;mso-position-vertical:absolute;mso-position-vertical-relative:text;mso-width-percent:0;mso-height-percent:0;mso-width-relative:margin;mso-height-relative:margin" o:gfxdata="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" strokecolor="black [3200]" strokeweight="1.5pt">
+              <v:shape w14:anchorId="393B3004" id="Straight Arrow Connector 5" o:spid="_x0000_s1026" type="#_x0000_t32" style="position:absolute;margin-left:18pt;margin-top:16.6pt;width:53.4pt;height:0;z-index:251773952;visibility:visible;mso-wrap-style:square;mso-width-percent:0;mso-height-percent:0;mso-wrap-distance-left:9pt;mso-wrap-distance-top:0;mso-wrap-distance-right:9pt;mso-wrap-distance-bottom:0;mso-position-horizontal:absolute;mso-position-horizontal-relative:text;mso-position-vertical:absolute;mso-position-vertical-relative:text;mso-width-percent:0;mso-height-percent:0;mso-width-relative:margin;mso-height-relative:margin" o:gfxdata="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" strokecolor="black [3200]" strokeweight="1.5pt">
                 <v:stroke endarrow="block" joinstyle="miter"/>
               </v:shape>
             </w:pict>
@@ -6533,7 +6532,7 @@
           </mc:Choice>
           <mc:Fallback>
             <w:pict>
-              <v:shape w14:anchorId="281A12D6" id="Straight Arrow Connector 5" o:spid="_x0000_s1026" type="#_x0000_t32" style="position:absolute;margin-left:330pt;margin-top:17.6pt;width:53.4pt;height:0;z-index:252168192;visibility:visible;mso-wrap-style:square;mso-width-percent:0;mso-height-percent:0;mso-wrap-distance-left:9pt;mso-wrap-distance-top:0;mso-wrap-distance-right:9pt;mso-wrap-distance-bottom:0;mso-position-horizontal:absolute;mso-position-horizontal-relative:text;mso-position-vertical:absolute;mso-position-vertical-relative:text;mso-width-percent:0;mso-height-percent:0;mso-width-relative:margin;mso-height-relative:margin" o:gfxdata="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" strokecolor="black [3200]" strokeweight="1.5pt">
+              <v:shape w14:anchorId="4B3533BB" id="Straight Arrow Connector 5" o:spid="_x0000_s1026" type="#_x0000_t32" style="position:absolute;margin-left:330pt;margin-top:17.6pt;width:53.4pt;height:0;z-index:252168192;visibility:visible;mso-wrap-style:square;mso-width-percent:0;mso-height-percent:0;mso-wrap-distance-left:9pt;mso-wrap-distance-top:0;mso-wrap-distance-right:9pt;mso-wrap-distance-bottom:0;mso-position-horizontal:absolute;mso-position-horizontal-relative:text;mso-position-vertical:absolute;mso-position-vertical-relative:text;mso-width-percent:0;mso-height-percent:0;mso-width-relative:margin;mso-height-relative:margin" o:gfxdata="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" strokecolor="black [3200]" strokeweight="1.5pt">
                 <v:stroke endarrow="block" joinstyle="miter"/>
               </v:shape>
             </w:pict>
@@ -6608,7 +6607,7 @@
           </mc:Choice>
           <mc:Fallback>
             <w:pict>
-              <v:shape w14:anchorId="1F6FCA19" id="Straight Arrow Connector 5" o:spid="_x0000_s1026" type="#_x0000_t32" style="position:absolute;margin-left:223.2pt;margin-top:17pt;width:53.4pt;height:0;z-index:252138496;visibility:visible;mso-wrap-style:square;mso-width-percent:0;mso-height-percent:0;mso-wrap-distance-left:9pt;mso-wrap-distance-top:0;mso-wrap-distance-right:9pt;mso-wrap-distance-bottom:0;mso-position-horizontal:absolute;mso-position-horizontal-relative:text;mso-position-vertical:absolute;mso-position-vertical-relative:text;mso-width-percent:0;mso-height-percent:0;mso-width-relative:margin;mso-height-relative:margin" o:gfxdata="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" strokecolor="black [3200]" strokeweight="1.5pt">
+              <v:shape w14:anchorId="6198D346" id="Straight Arrow Connector 5" o:spid="_x0000_s1026" type="#_x0000_t32" style="position:absolute;margin-left:223.2pt;margin-top:17pt;width:53.4pt;height:0;z-index:252138496;visibility:visible;mso-wrap-style:square;mso-width-percent:0;mso-height-percent:0;mso-wrap-distance-left:9pt;mso-wrap-distance-top:0;mso-wrap-distance-right:9pt;mso-wrap-distance-bottom:0;mso-position-horizontal:absolute;mso-position-horizontal-relative:text;mso-position-vertical:absolute;mso-position-vertical-relative:text;mso-width-percent:0;mso-height-percent:0;mso-width-relative:margin;mso-height-relative:margin" o:gfxdata="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" strokecolor="black [3200]" strokeweight="1.5pt">
                 <v:stroke endarrow="block" joinstyle="miter"/>
               </v:shape>
             </w:pict>
@@ -6683,7 +6682,7 @@
           </mc:Choice>
           <mc:Fallback>
             <w:pict>
-              <v:shape w14:anchorId="0A523A20" id="Straight Arrow Connector 5" o:spid="_x0000_s1026" type="#_x0000_t32" style="position:absolute;margin-left:121.2pt;margin-top:17pt;width:53.4pt;height:0;z-index:252108800;visibility:visible;mso-wrap-style:square;mso-width-percent:0;mso-height-percent:0;mso-wrap-distance-left:9pt;mso-wrap-distance-top:0;mso-wrap-distance-right:9pt;mso-wrap-distance-bottom:0;mso-position-horizontal:absolute;mso-position-horizontal-relative:text;mso-position-vertical:absolute;mso-position-vertical-relative:text;mso-width-percent:0;mso-height-percent:0;mso-width-relative:margin;mso-height-relative:margin" o:gfxdata="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" strokecolor="black [3200]" strokeweight="1.5pt">
+              <v:shape w14:anchorId="6AFA158F" id="Straight Arrow Connector 5" o:spid="_x0000_s1026" type="#_x0000_t32" style="position:absolute;margin-left:121.2pt;margin-top:17pt;width:53.4pt;height:0;z-index:252108800;visibility:visible;mso-wrap-style:square;mso-width-percent:0;mso-height-percent:0;mso-wrap-distance-left:9pt;mso-wrap-distance-top:0;mso-wrap-distance-right:9pt;mso-wrap-distance-bottom:0;mso-position-horizontal:absolute;mso-position-horizontal-relative:text;mso-position-vertical:absolute;mso-position-vertical-relative:text;mso-width-percent:0;mso-height-percent:0;mso-width-relative:margin;mso-height-relative:margin" o:gfxdata="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" strokecolor="black [3200]" strokeweight="1.5pt">
                 <v:stroke endarrow="block" joinstyle="miter"/>
               </v:shape>
             </w:pict>
@@ -6768,7 +6767,7 @@
           </mc:Choice>
           <mc:Fallback>
             <w:pict>
-              <v:rect w14:anchorId="46FEF1FD" id="Rectangle 3" o:spid="_x0000_s1026" style="position:absolute;margin-left:141pt;margin-top:48.2pt;width:59.4pt;height:28.8pt;z-index:251829248;visibility:visible;mso-wrap-style:square;mso-width-percent:0;mso-height-percent:0;mso-wrap-distance-left:9pt;mso-wrap-distance-top:0;mso-wrap-distance-right:9pt;mso-wrap-distance-bottom:0;mso-position-horizontal:absolute;mso-position-horizontal-relative:text;mso-position-vertical:absolute;mso-position-vertical-relative:text;mso-width-percent:0;mso-height-percent:0;mso-width-relative:margin;mso-height-relative:margin;v-text-anchor:middle" o:gfxdata="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" filled="f" strokecolor="black [3213]" strokeweight="1.5pt"/>
+              <v:rect w14:anchorId="12E1A958" id="Rectangle 3" o:spid="_x0000_s1026" style="position:absolute;margin-left:141pt;margin-top:48.2pt;width:59.4pt;height:28.8pt;z-index:251829248;visibility:visible;mso-wrap-style:square;mso-width-percent:0;mso-height-percent:0;mso-wrap-distance-left:9pt;mso-wrap-distance-top:0;mso-wrap-distance-right:9pt;mso-wrap-distance-bottom:0;mso-position-horizontal:absolute;mso-position-horizontal-relative:text;mso-position-vertical:absolute;mso-position-vertical-relative:text;mso-width-percent:0;mso-height-percent:0;mso-width-relative:margin;mso-height-relative:margin;v-text-anchor:middle" o:gfxdata="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" filled="f" strokecolor="black [3213]" strokeweight="1.5pt"/>
             </w:pict>
           </mc:Fallback>
         </mc:AlternateContent>
@@ -6851,7 +6850,7 @@
           </mc:Choice>
           <mc:Fallback>
             <w:pict>
-              <v:rect w14:anchorId="0604C137" id="Rectangle 3" o:spid="_x0000_s1026" style="position:absolute;margin-left:383.4pt;margin-top:2.4pt;width:59.4pt;height:28.8pt;z-index:252455936;visibility:visible;mso-wrap-style:square;mso-width-percent:0;mso-height-percent:0;mso-wrap-distance-left:9pt;mso-wrap-distance-top:0;mso-wrap-distance-right:9pt;mso-wrap-distance-bottom:0;mso-position-horizontal:absolute;mso-position-horizontal-relative:text;mso-position-vertical:absolute;mso-position-vertical-relative:text;mso-width-percent:0;mso-height-percent:0;mso-width-relative:margin;mso-height-relative:margin;v-text-anchor:middle" o:gfxdata="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" filled="f" strokecolor="black [3213]" strokeweight="1.5pt"/>
+              <v:rect w14:anchorId="6C6625CD" id="Rectangle 3" o:spid="_x0000_s1026" style="position:absolute;margin-left:383.4pt;margin-top:2.4pt;width:59.4pt;height:28.8pt;z-index:252455936;visibility:visible;mso-wrap-style:square;mso-width-percent:0;mso-height-percent:0;mso-wrap-distance-left:9pt;mso-wrap-distance-top:0;mso-wrap-distance-right:9pt;mso-wrap-distance-bottom:0;mso-position-horizontal:absolute;mso-position-horizontal-relative:text;mso-position-vertical:absolute;mso-position-vertical-relative:text;mso-width-percent:0;mso-height-percent:0;mso-width-relative:margin;mso-height-relative:margin;v-text-anchor:middle" o:gfxdata="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" filled="f" strokecolor="black [3213]" strokeweight="1.5pt"/>
             </w:pict>
           </mc:Fallback>
         </mc:AlternateContent>
@@ -6935,7 +6934,7 @@
           </mc:Choice>
           <mc:Fallback>
             <w:pict>
-              <v:shape w14:anchorId="1E3467D8" id="Straight Arrow Connector 9" o:spid="_x0000_s1026" type="#_x0000_t32" style="position:absolute;margin-left:509.4pt;margin-top:10.65pt;width:5.4pt;height:34.2pt;z-index:252532736;visibility:visible;mso-wrap-style:square;mso-width-percent:0;mso-height-percent:0;mso-wrap-distance-left:9pt;mso-wrap-distance-top:0;mso-wrap-distance-right:9pt;mso-wrap-distance-bottom:0;mso-position-horizontal:absolute;mso-position-horizontal-relative:text;mso-position-vertical:absolute;mso-position-vertical-relative:text;mso-width-percent:0;mso-height-percent:0;mso-width-relative:margin;mso-height-relative:margin" o:gfxdata="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" strokecolor="black [3200]" strokeweight="1.5pt">
+              <v:shape w14:anchorId="6EF3CE61" id="Straight Arrow Connector 9" o:spid="_x0000_s1026" type="#_x0000_t32" style="position:absolute;margin-left:509.4pt;margin-top:10.65pt;width:5.4pt;height:34.2pt;z-index:252532736;visibility:visible;mso-wrap-style:square;mso-width-percent:0;mso-height-percent:0;mso-wrap-distance-left:9pt;mso-wrap-distance-top:0;mso-wrap-distance-right:9pt;mso-wrap-distance-bottom:0;mso-position-horizontal:absolute;mso-position-horizontal-relative:text;mso-position-vertical:absolute;mso-position-vertical-relative:text;mso-width-percent:0;mso-height-percent:0;mso-width-relative:margin;mso-height-relative:margin" o:gfxdata="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" strokecolor="black [3200]" strokeweight="1.5pt">
                 <v:stroke endarrow="block" joinstyle="miter"/>
               </v:shape>
             </w:pict>
@@ -7004,7 +7003,7 @@
           </mc:Choice>
           <mc:Fallback>
             <w:pict>
-              <v:shape w14:anchorId="3E97C47F" id="Straight Arrow Connector 9" o:spid="_x0000_s1026" type="#_x0000_t32" style="position:absolute;margin-left:430.8pt;margin-top:6.45pt;width:33.6pt;height:0;z-index:252492800;visibility:visible;mso-wrap-style:square;mso-wrap-distance-left:9pt;mso-wrap-distance-top:0;mso-wrap-distance-right:9pt;mso-wrap-distance-bottom:0;mso-position-horizontal:absolute;mso-position-horizontal-relative:text;mso-position-vertical:absolute;mso-position-vertical-relative:text" o:gfxdata="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" strokecolor="black [3200]" strokeweight="1.5pt">
+              <v:shape w14:anchorId="721EDED8" id="Straight Arrow Connector 9" o:spid="_x0000_s1026" type="#_x0000_t32" style="position:absolute;margin-left:430.8pt;margin-top:6.45pt;width:33.6pt;height:0;z-index:252492800;visibility:visible;mso-wrap-style:square;mso-wrap-distance-left:9pt;mso-wrap-distance-top:0;mso-wrap-distance-right:9pt;mso-wrap-distance-bottom:0;mso-position-horizontal:absolute;mso-position-horizontal-relative:text;mso-position-vertical:absolute;mso-position-vertical-relative:text" o:gfxdata="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" strokecolor="black [3200]" strokeweight="1.5pt">
                 <v:stroke endarrow="block" joinstyle="miter"/>
               </v:shape>
             </w:pict>
@@ -7212,7 +7211,7 @@
           </mc:Choice>
           <mc:Fallback>
             <w:pict>
-              <v:shape w14:anchorId="66A8780B" id="Straight Arrow Connector 5" o:spid="_x0000_s1026" type="#_x0000_t32" style="position:absolute;margin-left:173.4pt;margin-top:4.8pt;width:14.4pt;height:23.4pt;flip:x;z-index:251877376;visibility:visible;mso-wrap-style:square;mso-width-percent:0;mso-height-percent:0;mso-wrap-distance-left:9pt;mso-wrap-distance-top:0;mso-wrap-distance-right:9pt;mso-wrap-distance-bottom:0;mso-position-horizontal:absolute;mso-position-horizontal-relative:text;mso-position-vertical:absolute;mso-position-vertical-relative:text;mso-width-percent:0;mso-height-percent:0;mso-width-relative:margin;mso-height-relative:margin" o:gfxdata="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" strokecolor="black [3200]" strokeweight="1.5pt">
+              <v:shape w14:anchorId="595746FE" id="Straight Arrow Connector 5" o:spid="_x0000_s1026" type="#_x0000_t32" style="position:absolute;margin-left:173.4pt;margin-top:4.8pt;width:14.4pt;height:23.4pt;flip:x;z-index:251877376;visibility:visible;mso-wrap-style:square;mso-width-percent:0;mso-height-percent:0;mso-wrap-distance-left:9pt;mso-wrap-distance-top:0;mso-wrap-distance-right:9pt;mso-wrap-distance-bottom:0;mso-position-horizontal:absolute;mso-position-horizontal-relative:text;mso-position-vertical:absolute;mso-position-vertical-relative:text;mso-width-percent:0;mso-height-percent:0;mso-width-relative:margin;mso-height-relative:margin" o:gfxdata="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" strokecolor="black [3200]" strokeweight="1.5pt">
                 <v:stroke endarrow="block" joinstyle="miter"/>
               </v:shape>
             </w:pict>
@@ -7306,7 +7305,7 @@
           </mc:Choice>
           <mc:Fallback>
             <w:pict>
-              <v:line w14:anchorId="4936099E" id="Straight Connector 4" o:spid="_x0000_s1026" style="position:absolute;z-index:251865088;visibility:visible;mso-wrap-style:square;mso-height-percent:0;mso-wrap-distance-left:9pt;mso-wrap-distance-top:0;mso-wrap-distance-right:9pt;mso-wrap-distance-bottom:0;mso-position-horizontal:absolute;mso-position-horizontal-relative:text;mso-position-vertical:absolute;mso-position-vertical-relative:text;mso-height-percent:0;mso-height-relative:margin" from="171.6pt,8.2pt" to="171.6pt,37pt" o:gfxdata="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" strokecolor="black [3213]" strokeweight="1.5pt">
+              <v:line w14:anchorId="0188645F" id="Straight Connector 4" o:spid="_x0000_s1026" style="position:absolute;z-index:251865088;visibility:visible;mso-wrap-style:square;mso-height-percent:0;mso-wrap-distance-left:9pt;mso-wrap-distance-top:0;mso-wrap-distance-right:9pt;mso-wrap-distance-bottom:0;mso-position-horizontal:absolute;mso-position-horizontal-relative:text;mso-position-vertical:absolute;mso-position-vertical-relative:text;mso-height-percent:0;mso-height-relative:margin" from="171.6pt,8.2pt" to="171.6pt,37pt" o:gfxdata="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" strokecolor="black [3213]" strokeweight="1.5pt">
                 <v:stroke joinstyle="miter"/>
               </v:line>
             </w:pict>

</xml_diff>